<commit_message>
Update FENCEWALL user manual for 1.2.1
</commit_message>
<xml_diff>
--- a/docs/FenceWall_Manuale_Utente.docx
+++ b/docs/FenceWall_Manuale_Utente.docx
@@ -75,7 +75,7 @@
         <w:jc w:val="center"/>
       </w:pPr>
       <w:r>
-        <w:t>Versione 1.2 - 07/08/2026</w:t>
+        <w:t>Versione 1.2.1 - 29/10/2026</w:t>
       </w:r>
     </w:p>
     <w:p>
@@ -165,7 +165,7 @@
           </w:tcPr>
           <w:p>
             <w:r>
-              <w:t>1.2</w:t>
+              <w:t>1.2.1</w:t>
             </w:r>
           </w:p>
         </w:tc>
@@ -204,7 +204,7 @@
           </w:tcPr>
           <w:p>
             <w:r>
-              <w:t>07/08/2026</w:t>
+              <w:t>29/10/2026</w:t>
             </w:r>
           </w:p>
         </w:tc>
@@ -264,7 +264,7 @@
     </w:p>
     <w:p>
       <w:r>
-        <w:t>FENCEWALL riceve i dati dalla seriale dell’apparato di scherma e li mostra in tempo reale sui ledwall. Per il funzionamento completo è necessario che FENCEWALL abbia un collegamento a internet: foto atleti, video pubblicitari ed eventuali bandiere non standard vengono scaricati dal server. Il sistema può lavorare in due modalità:</w:t>
+        <w:t>FENCEWALL riceve i dati seriali dall'apparato di scherma e li mostra in tempo reale. Il tabellone parte e continua a funzionare anche senza Internet; il collegamento Internet serve per aggiornamenti e per scaricare dal portale foto atleti, video e bandiere non standard. Il sistema offre tre modalità di visualizzazione:</w:t>
       </w:r>
     </w:p>
     <w:p>
@@ -288,7 +288,15 @@
         <w:pStyle w:val="ListBullet"/>
       </w:pPr>
       <w:r>
-        <w:t>Quando non arrivano dati o il timer resta fermo per il tempo configurato, il sistema mostra automaticamente i video pubblicitari o l’immagine di pausa.</w:t>
+        <w:t>MONITOR: l'uscita rossa alimenta il primo monitor; l'uscita verde alimenta un secondo monitor, se collegato. Ogni schermo mostra il tabellone a pieno schermo.</w:t>
+      </w:r>
+    </w:p>
+    <w:p>
+      <w:pPr>
+        <w:pStyle w:val="ListBullet"/>
+      </w:pPr>
+      <w:r>
+        <w:t>La pausa pubblicitaria è facoltativa: può avviarsi dopo un intervallo configurabile oppure essere disattivata dal display OLED.</w:t>
       </w:r>
     </w:p>
     <w:p>
@@ -450,6 +458,10 @@
         <w:gridCol w:w="2523"/>
       </w:tblGrid>
       <w:tr>
+        <w:trPr>
+          <w:tblHeader/>
+          <w:cantSplit/>
+        </w:trPr>
         <w:tc>
           <w:tcPr>
             <w:tcW w:type="dxa" w:w="2523"/>
@@ -544,6 +556,9 @@
         </w:tc>
       </w:tr>
       <w:tr>
+        <w:trPr>
+          <w:cantSplit/>
+        </w:trPr>
         <w:tc>
           <w:tcPr>
             <w:tcW w:type="dxa" w:w="2523"/>
@@ -613,6 +628,9 @@
         </w:tc>
       </w:tr>
       <w:tr>
+        <w:trPr>
+          <w:cantSplit/>
+        </w:trPr>
         <w:tc>
           <w:tcPr>
             <w:tcW w:type="dxa" w:w="2523"/>
@@ -660,7 +678,7 @@
           </w:tcPr>
           <w:p>
             <w:r>
-              <w:t>Quando serve impostare rete, modalità, spot, avatar, manuale, versione, aggiornamenti, riavvio o spegnimento.</w:t>
+              <w:t>Quando serve impostare rete, modalità, pausa, avatar, manuale, versione, aggiornamenti, riavvio o spegnimento.</w:t>
             </w:r>
           </w:p>
         </w:tc>
@@ -684,6 +702,9 @@
         </w:tc>
       </w:tr>
       <w:tr>
+        <w:trPr>
+          <w:cantSplit/>
+        </w:trPr>
         <w:tc>
           <w:tcPr>
             <w:tcW w:type="dxa" w:w="2523"/>
@@ -758,6 +779,9 @@
         </w:tc>
       </w:tr>
       <w:tr>
+        <w:trPr>
+          <w:cantSplit/>
+        </w:trPr>
         <w:tc>
           <w:tcPr>
             <w:tcW w:type="dxa" w:w="2523"/>
@@ -804,11 +828,8 @@
             <w:vAlign w:val="center"/>
           </w:tcPr>
           <w:p>
-            <w:pPr>
-              <w:spacing w:after="60"/>
-            </w:pPr>
             <w:r>
-              <w:t>Sempre consigliata per scaricare foto atleti, video pubblicitari, bandiere non standard e aggiornamenti.</w:t>
+              <w:t>Per aggiornamenti e sincronizzazione dei contenuti remoti. Non è obbligatoria per mostrare i dati seriali o usare una pausa già importata da USB.</w:t>
             </w:r>
           </w:p>
         </w:tc>
@@ -822,16 +843,16 @@
             <w:vAlign w:val="center"/>
           </w:tcPr>
           <w:p>
-            <w:pPr>
-              <w:spacing w:after="60"/>
-            </w:pPr>
             <w:r>
-              <w:t>Usare una rete con accesso internet quando devono essere sincronizzati contenuti dal server.</w:t>
+              <w:t>Collegare a Internet quando si vogliono aggiornare foto, video o bandiere dal portale.</w:t>
             </w:r>
           </w:p>
         </w:tc>
       </w:tr>
       <w:tr>
+        <w:trPr>
+          <w:cantSplit/>
+        </w:trPr>
         <w:tc>
           <w:tcPr>
             <w:tcW w:type="dxa" w:w="2523"/>
@@ -878,11 +899,8 @@
             <w:vAlign w:val="center"/>
           </w:tcPr>
           <w:p>
-            <w:pPr>
-              <w:spacing w:after="60"/>
-            </w:pPr>
             <w:r>
-              <w:t>In modalità LEDWALL invia l’immagine al ledwall frontale. In modalità SOTTOPEDANA invia l’immagine alla parte sinistra del sottopedana.</w:t>
+              <w:t>LEDWALL: fronte. SOTTOPEDANA: lato sinistro. MONITOR: primo monitor.</w:t>
             </w:r>
           </w:p>
         </w:tc>
@@ -906,6 +924,9 @@
         </w:tc>
       </w:tr>
       <w:tr>
+        <w:trPr>
+          <w:cantSplit/>
+        </w:trPr>
         <w:tc>
           <w:tcPr>
             <w:tcW w:type="dxa" w:w="2523"/>
@@ -952,11 +973,8 @@
             <w:vAlign w:val="center"/>
           </w:tcPr>
           <w:p>
-            <w:pPr>
-              <w:spacing w:after="60"/>
-            </w:pPr>
             <w:r>
-              <w:t>In modalità LEDWALL invia l’immagine specchiata al retro del ledwall. In modalità SOTTOPEDANA invia l’immagine alla parte destra del sottopedana.</w:t>
+              <w:t>LEDWALL: retro specchiato. SOTTOPEDANA: lato destro. MONITOR: secondo monitor, se collegato.</w:t>
             </w:r>
           </w:p>
         </w:tc>
@@ -980,6 +998,9 @@
         </w:tc>
       </w:tr>
       <w:tr>
+        <w:trPr>
+          <w:cantSplit/>
+        </w:trPr>
         <w:tc>
           <w:tcPr>
             <w:tcW w:type="dxa" w:w="2523"/>
@@ -1099,7 +1120,7 @@
         <w:pStyle w:val="ListBullet"/>
       </w:pPr>
       <w:r>
-        <w:t>Verificare alimentazione, rete e collegamenti video verso ledwall o processore ledwall.</w:t>
+        <w:t>Verificare alimentazione e collegamenti video. Collegare la rete se occorrono contenuti remoti o aggiornamenti; non è richiesta per il tabellone seriale.</w:t>
       </w:r>
     </w:p>
     <w:p>
@@ -1238,6 +1259,10 @@
         <w:gridCol w:w="3364"/>
       </w:tblGrid>
       <w:tr>
+        <w:trPr>
+          <w:tblHeader/>
+          <w:cantSplit/>
+        </w:trPr>
         <w:tc>
           <w:tcPr>
             <w:tcW w:type="dxa" w:w="3364"/>
@@ -1309,6 +1334,9 @@
         </w:tc>
       </w:tr>
       <w:tr>
+        <w:trPr>
+          <w:cantSplit/>
+        </w:trPr>
         <w:tc>
           <w:tcPr>
             <w:tcW w:type="dxa" w:w="3364"/>
@@ -1365,6 +1393,9 @@
         </w:tc>
       </w:tr>
       <w:tr>
+        <w:trPr>
+          <w:cantSplit/>
+        </w:trPr>
         <w:tc>
           <w:tcPr>
             <w:tcW w:type="dxa" w:w="3364"/>
@@ -1421,6 +1452,9 @@
         </w:tc>
       </w:tr>
       <w:tr>
+        <w:trPr>
+          <w:cantSplit/>
+        </w:trPr>
         <w:tc>
           <w:tcPr>
             <w:tcW w:type="dxa" w:w="3364"/>
@@ -1477,6 +1511,9 @@
         </w:tc>
       </w:tr>
       <w:tr>
+        <w:trPr>
+          <w:cantSplit/>
+        </w:trPr>
         <w:tc>
           <w:tcPr>
             <w:tcW w:type="dxa" w:w="3364"/>
@@ -1533,6 +1570,9 @@
         </w:tc>
       </w:tr>
       <w:tr>
+        <w:trPr>
+          <w:cantSplit/>
+        </w:trPr>
         <w:tc>
           <w:tcPr>
             <w:tcW w:type="dxa" w:w="3364"/>
@@ -1589,6 +1629,9 @@
         </w:tc>
       </w:tr>
       <w:tr>
+        <w:trPr>
+          <w:cantSplit/>
+        </w:trPr>
         <w:tc>
           <w:tcPr>
             <w:tcW w:type="dxa" w:w="3364"/>
@@ -1699,7 +1742,7 @@
     </w:p>
     <w:p>
       <w:r>
-        <w:t>Dalla schermata con il logo, premere il joystick centrale. Le voci disponibili sono: NETWORK, MODE, SPOT, AVATAR ATLETA, MANUALE, VERSIONE, UPDATE, REBOOT, POWER OFF.</w:t>
+        <w:t>Dalla schermata con il logo, premere il joystick centrale. Le voci, scorribili con il joystick, sono: NETWORK, MODE, PAUSA, AVATAR ATLETA, MANUALE, VERSIONE, UPDATE, REBOOT e POWER OFF.</w:t>
       </w:r>
     </w:p>
     <w:tbl>
@@ -1715,6 +1758,10 @@
         <w:gridCol w:w="3364"/>
       </w:tblGrid>
       <w:tr>
+        <w:trPr>
+          <w:tblHeader/>
+          <w:cantSplit/>
+        </w:trPr>
         <w:tc>
           <w:tcPr>
             <w:tcW w:type="dxa" w:w="3364"/>
@@ -1765,6 +1812,9 @@
         </w:tc>
       </w:tr>
       <w:tr>
+        <w:trPr>
+          <w:cantSplit/>
+        </w:trPr>
         <w:tc>
           <w:tcPr>
             <w:tcW w:type="dxa" w:w="3364"/>
@@ -1791,7 +1841,7 @@
           </w:tcPr>
           <w:p>
             <w:r>
-              <w:t>Configura rete ethernet via cavo.</w:t>
+              <w:t>Configura la rete Ethernet.</w:t>
             </w:r>
           </w:p>
         </w:tc>
@@ -1806,12 +1856,15 @@
           </w:tcPr>
           <w:p>
             <w:r>
-              <w:t>Permette di modificare IP, subnet mask in formato 255.255.255.0 e gateway. La WLAN non viene modificata dal menu.</w:t>
+              <w:t>Selezionare DHCP per ricevere automaticamente i parametri dalla rete oppure STATIC per impostare IP, subnet mask e gateway. Salvare con il pulsante bianco.</w:t>
             </w:r>
           </w:p>
         </w:tc>
       </w:tr>
       <w:tr>
+        <w:trPr>
+          <w:cantSplit/>
+        </w:trPr>
         <w:tc>
           <w:tcPr>
             <w:tcW w:type="dxa" w:w="3364"/>
@@ -1853,12 +1906,15 @@
           </w:tcPr>
           <w:p>
             <w:r>
-              <w:t>LEDWALL usa l’uscita rossa per il fronte e l’uscita verde per il retro specchiato. SOTTOPEDANA usa l’uscita rossa per il lato sinistro e l’uscita verde per il lato destro. Dopo il salvataggio il sistema si riavvia automaticamente.</w:t>
+              <w:t>Scegliere LEDWALL, SOTTOPEDANA o MONITOR. Dopo il salvataggio FENCEWALL si riavvia automaticamente.</w:t>
             </w:r>
           </w:p>
         </w:tc>
       </w:tr>
       <w:tr>
+        <w:trPr>
+          <w:cantSplit/>
+        </w:trPr>
         <w:tc>
           <w:tcPr>
             <w:tcW w:type="dxa" w:w="3364"/>
@@ -1870,7 +1926,7 @@
           </w:tcPr>
           <w:p>
             <w:r>
-              <w:t>SPOT</w:t>
+              <w:t>PAUSA</w:t>
             </w:r>
           </w:p>
         </w:tc>
@@ -1885,7 +1941,7 @@
           </w:tcPr>
           <w:p>
             <w:r>
-              <w:t>Configura i minuti di inattivita.</w:t>
+              <w:t>Configura l'avvio e la sorgente della pausa.</w:t>
             </w:r>
           </w:p>
         </w:tc>
@@ -1900,12 +1956,15 @@
           </w:tcPr>
           <w:p>
             <w:r>
-              <w:t>Imposta dopo quanti minuti con timer invariato deve partire la pubblicità. Se non arriva alcun dato seriale, la pausa parte automaticamente dopo circa 10 secondi.</w:t>
+              <w:t>DOPO: scegliere i minuti di inattività o NO per disattivare la pausa automatica. FONTE: INTERNET o USB. IMPORTA USB K2 copia i file dalla chiavetta nella memoria locale.</w:t>
             </w:r>
           </w:p>
         </w:tc>
       </w:tr>
       <w:tr>
+        <w:trPr>
+          <w:cantSplit/>
+        </w:trPr>
         <w:tc>
           <w:tcPr>
             <w:tcW w:type="dxa" w:w="3364"/>
@@ -1953,6 +2012,9 @@
         </w:tc>
       </w:tr>
       <w:tr>
+        <w:trPr>
+          <w:cantSplit/>
+        </w:trPr>
         <w:tc>
           <w:tcPr>
             <w:tcW w:type="dxa" w:w="3364"/>
@@ -2000,6 +2062,9 @@
         </w:tc>
       </w:tr>
       <w:tr>
+        <w:trPr>
+          <w:cantSplit/>
+        </w:trPr>
         <w:tc>
           <w:tcPr>
             <w:tcW w:type="dxa" w:w="3364"/>
@@ -2041,12 +2106,15 @@
           </w:tcPr>
           <w:p>
             <w:r>
-              <w:t>Richiede connessione internet. Può installare automaticamente componenti richiesti, come QRCode manuale e ffmpeg per ottimizzare i video pubblicitari. Se richiesto, confermare il riavvio con il pulsante bianco.</w:t>
+              <w:t>Richiede Internet. Scarica gli aggiornamenti e installa le dipendenze richieste. Se viene proposto il riavvio, confermare con il pulsante bianco.</w:t>
             </w:r>
           </w:p>
         </w:tc>
       </w:tr>
       <w:tr>
+        <w:trPr>
+          <w:cantSplit/>
+        </w:trPr>
         <w:tc>
           <w:tcPr>
             <w:tcW w:type="dxa" w:w="3364"/>
@@ -2079,6 +2147,9 @@
         </w:tc>
       </w:tr>
       <w:tr>
+        <w:trPr>
+          <w:cantSplit/>
+        </w:trPr>
         <w:tc>
           <w:tcPr>
             <w:tcW w:type="dxa" w:w="3364"/>
@@ -2111,6 +2182,9 @@
         </w:tc>
       </w:tr>
       <w:tr>
+        <w:trPr>
+          <w:cantSplit/>
+        </w:trPr>
         <w:tc>
           <w:tcPr>
             <w:tcW w:type="dxa" w:w="3364"/>
@@ -2228,6 +2302,10 @@
         <w:gridCol w:w="3364"/>
       </w:tblGrid>
       <w:tr>
+        <w:trPr>
+          <w:tblHeader/>
+          <w:cantSplit/>
+        </w:trPr>
         <w:tc>
           <w:tcPr>
             <w:tcW w:type="dxa" w:w="3364"/>
@@ -2299,6 +2377,9 @@
         </w:tc>
       </w:tr>
       <w:tr>
+        <w:trPr>
+          <w:cantSplit/>
+        </w:trPr>
         <w:tc>
           <w:tcPr>
             <w:tcW w:type="dxa" w:w="3364"/>
@@ -2355,6 +2436,9 @@
         </w:tc>
       </w:tr>
       <w:tr>
+        <w:trPr>
+          <w:cantSplit/>
+        </w:trPr>
         <w:tc>
           <w:tcPr>
             <w:tcW w:type="dxa" w:w="3364"/>
@@ -2410,6 +2494,56 @@
           </w:p>
         </w:tc>
       </w:tr>
+      <w:tr>
+        <w:trPr>
+          <w:cantSplit/>
+        </w:trPr>
+        <w:tc>
+          <w:tcPr>
+            <w:tcW w:type="dxa" w:w="3364"/>
+            <w:top w:val="single" w:sz="8" w:space="0" w:color="D0D5DD"/>
+            <w:left w:val="single" w:sz="8" w:space="0" w:color="D0D5DD"/>
+            <w:bottom w:val="single" w:sz="8" w:space="0" w:color="D0D5DD"/>
+            <w:right w:val="single" w:sz="8" w:space="0" w:color="D0D5DD"/>
+            <w:vAlign w:val="center"/>
+          </w:tcPr>
+          <w:p>
+            <w:r>
+              <w:t>MONITOR</w:t>
+            </w:r>
+          </w:p>
+        </w:tc>
+        <w:tc>
+          <w:tcPr>
+            <w:tcW w:type="dxa" w:w="3364"/>
+            <w:top w:val="single" w:sz="8" w:space="0" w:color="D0D5DD"/>
+            <w:left w:val="single" w:sz="8" w:space="0" w:color="D0D5DD"/>
+            <w:bottom w:val="single" w:sz="8" w:space="0" w:color="D0D5DD"/>
+            <w:right w:val="single" w:sz="8" w:space="0" w:color="D0D5DD"/>
+            <w:vAlign w:val="center"/>
+          </w:tcPr>
+          <w:p>
+            <w:r>
+              <w:t>Per uno o due monitor.</w:t>
+            </w:r>
+          </w:p>
+        </w:tc>
+        <w:tc>
+          <w:tcPr>
+            <w:tcW w:type="dxa" w:w="3364"/>
+            <w:top w:val="single" w:sz="8" w:space="0" w:color="D0D5DD"/>
+            <w:left w:val="single" w:sz="8" w:space="0" w:color="D0D5DD"/>
+            <w:bottom w:val="single" w:sz="8" w:space="0" w:color="D0D5DD"/>
+            <w:right w:val="single" w:sz="8" w:space="0" w:color="D0D5DD"/>
+            <w:vAlign w:val="center"/>
+          </w:tcPr>
+          <w:p>
+            <w:r>
+              <w:t>Primo monitor a pieno schermo; secondo, se collegato, con lo stesso tabellone. Uscite estese, anche con formati diversi.</w:t>
+            </w:r>
+          </w:p>
+        </w:tc>
+      </w:tr>
     </w:tbl>
     <w:p>
       <w:pPr>
@@ -2421,7 +2555,7 @@
     </w:p>
     <w:p>
       <w:r>
-        <w:t>Il sistema gestisce automaticamente la visualizzazione dei contenuti di pausa.</w:t>
+        <w:t>La pausa può mostrare video, immagini o, in assenza di file validi, l'immagine fissa di riserva. Si configura dal menu OLED PAUSA.</w:t>
       </w:r>
     </w:p>
     <w:p>
@@ -2429,7 +2563,7 @@
         <w:pStyle w:val="ListBullet"/>
       </w:pPr>
       <w:r>
-        <w:t>Se non arriva alcun dato dalla seriale, dopo circa 10 secondi viene mostrato il contenuto di pausa.</w:t>
+        <w:t>Con DOPO impostato su un numero di minuti, la pausa parte dopo quel tempo senza cambiamenti del tabellone. Se i dati seriali si interrompono, può partire dopo circa 10 secondi.</w:t>
       </w:r>
     </w:p>
     <w:p>
@@ -2437,7 +2571,7 @@
         <w:pStyle w:val="ListBullet"/>
       </w:pPr>
       <w:r>
-        <w:t>Se il timer rimane invariato per il numero di minuti impostato nel menu SPOT, viene mostrata la pubblicità.</w:t>
+        <w:t>Con DOPO impostato su NO la pausa automatica non parte, anche se i dati seriali si interrompono; resta visibile l'ultimo tabellone.</w:t>
       </w:r>
     </w:p>
     <w:p>
@@ -2445,7 +2579,7 @@
         <w:pStyle w:val="ListBullet"/>
       </w:pPr>
       <w:r>
-        <w:t>Se sono presenti video nella cartella/portale, i video vengono riprodotti in loop.</w:t>
+        <w:t>FONTE INTERNET usa i contenuti scaricati dal portale. FONTE USB usa i file già importati dalla chiavetta e conservati nella memoria locale.</w:t>
       </w:r>
     </w:p>
     <w:p>
@@ -2453,7 +2587,7 @@
         <w:pStyle w:val="ListBullet"/>
       </w:pPr>
       <w:r>
-        <w:t>Se non sono presenti video, viene mostrata l’immagine pausa.jpg.</w:t>
+        <w:t>Video e immagini della sorgente scelta vengono riprodotti nell'ordine dei nomi dei file. Ogni immagine resta visibile 10 secondi con una breve dissolvenza; i video arrivano alla fine. Se non ci sono file validi appare l'immagine di riserva.</w:t>
       </w:r>
     </w:p>
     <w:p>
@@ -2461,7 +2595,39 @@
         <w:pStyle w:val="ListBullet"/>
       </w:pPr>
       <w:r>
-        <w:t>Il ritorno al tabellone avviene quando riprendono dati significativi: cambio timer, cambio nomi, inversione atleti o cambio periodo.</w:t>
+        <w:t>La pausa termina quando cambiano i dati del tabellone: timer, punteggi, cartellini, stoccate, nomi, periodo o posizione degli atleti. Non è necessario aspettare un nuovo timer.</w:t>
+      </w:r>
+    </w:p>
+    <w:p>
+      <w:pPr>
+        <w:pStyle w:val="Heading2"/>
+      </w:pPr>
+      <w:r>
+        <w:t>Importare la pausa da USB</w:t>
+      </w:r>
+    </w:p>
+    <w:p>
+      <w:pPr/>
+      <w:r>
+        <w:t>1. Preparare una chiavetta con una cartella PAUSA nella directory principale. Inserire direttamente nella cartella file video .mp4, .webm, .mov, .m4v o .ogg e/o immagini .jpg, .jpeg, .png o .webp; non usare sottocartelle. Per decidere l'ordine, anteporre 01-, 02- e così via ai nomi.</w:t>
+      </w:r>
+    </w:p>
+    <w:p>
+      <w:pPr/>
+      <w:r>
+        <w:t>2. Inserire la chiavetta. Sul display aprire PAUSA, selezionare IMPORTA USB K2 e premere il pulsante bianco. Attendere il messaggio Importati N file prima di rimuoverla: la conversione dei video può richiedere alcuni minuti.</w:t>
+      </w:r>
+    </w:p>
+    <w:p>
+      <w:pPr/>
+      <w:r>
+        <w:t>3. Dopo l'importazione la sorgente diventa USB e la visualizzazione si riavvia. I file sono copiati in locale e restano disponibili anche dopo lo spegnimento o la rimozione della chiavetta. Non vengono ricopiati a ogni avvio.</w:t>
+      </w:r>
+    </w:p>
+    <w:p>
+      <w:pPr/>
+      <w:r>
+        <w:t>4. Una nuova importazione riuscita sostituisce solo i vecchi file della pausa USB. Se la cartella è vuota o una conversione fallisce, i file importati in precedenza restano disponibili. Per usare nuovamente i contenuti del portale impostare FONTE INTERNET e salvare.</w:t>
       </w:r>
     </w:p>
     <w:p>
@@ -2586,7 +2752,7 @@
         <w:ind w:left="340" w:hanging="198"/>
       </w:pPr>
       <w:r>
-        <w:t>5.  FENCEWALL scarica i contenuti remoti all’avvio del servizio. Se si cambia il materiale durante un evento, eseguire UPDATE/REBOOT o riavviare FENCEWALL quando previsto dalla procedura tecnica.</w:t>
+        <w:t>5.  Quando FONTE INTERNET è selezionata, FENCEWALL sincronizza i contenuti remoti. Se sono stati modificati durante un evento e non compaiono ancora, attendere la sincronizzazione o riavviare FENCEWALL quando possibile.</w:t>
       </w:r>
     </w:p>
     <w:p>
@@ -2617,24 +2783,8 @@
             <w:right w:val="single" w:sz="16" w:space="0" w:color="B30D16"/>
           </w:tcPr>
           <w:p>
-            <w:pPr>
-              <w:spacing w:after="40"/>
-            </w:pPr>
             <w:r>
-              <w:rPr>
-                <w:b/>
-                <w:color w:val="111111"/>
-                <w:sz w:val="22"/>
-              </w:rPr>
-              <w:t>Regola per i nomi</w:t>
-            </w:r>
-          </w:p>
-          <w:p>
-            <w:pPr>
-              <w:spacing w:after="0"/>
-            </w:pPr>
-            <w:r>
-              <w:t>Il riferimento dell’atleta nel portale deve corrispondere al nome che arriva nello streaming dati seriale. Se il nome non corrisponde, la foto può non essere trovata.</w:t>
+              <w:t>Regola per i nomi: il riferimento atleta nel portale deve corrispondere al nome ricevuto dalla seriale. Se la seriale tronca il nome a 20 caratteri, il sistema prova ad abbinare anche i primi 20; evitare atleti con gli stessi primi 20 caratteri.</w:t>
             </w:r>
           </w:p>
         </w:tc>
@@ -2646,7 +2796,7 @@
         <w:pStyle w:val="ListBullet"/>
       </w:pPr>
       <w:r>
-        <w:t>Caricare la foto dell’atleta nella sezione foto.</w:t>
+        <w:t>Caricare la foto dell'atleta nella sezione Foto. Il portale la riduce automaticamente per il tabellone, anche se arriva da uno smartphone.</w:t>
       </w:r>
     </w:p>
     <w:p>
@@ -2675,7 +2825,39 @@
     </w:p>
     <w:p>
       <w:r>
-        <w:t>Esempio: se dalla seriale arriva "BIANCHI MASSIMILIANO", nel portale il riferimento deve essere coerente con quel testo. Evitare abbreviazioni non presenti nello streaming.</w:t>
+        <w:t>Esempio: se dalla seriale arriva "BIANCHI MASSIMILIANO", il riferimento sul portale deve iniziare con lo stesso nome. Se il nome completo supera 20 caratteri, verificare che i primi 20 caratteri identifichino un solo atleta.</w:t>
+      </w:r>
+    </w:p>
+    <w:p>
+      <w:pPr>
+        <w:pStyle w:val="Heading2"/>
+      </w:pPr>
+      <w:r>
+        <w:t>Importazione e sostituzione delle foto</w:t>
+      </w:r>
+    </w:p>
+    <w:p>
+      <w:pPr>
+        <w:pStyle w:val="ListBullet"/>
+      </w:pPr>
+      <w:r>
+        <w:t>Per preparare molti atleti, usare Import atleti da Excel nella sezione Foto: caricare un file .xlsx o .csv con un nome nella prima cella non vuota di ciascuna riga. Il portale crea i riferimenti e mostra un segnaposto di importazione, ma non invia quell'immagine ai FENCEWALL. Sul tabellone compare il placeholder locale solo se AVATAR ATLETA è su SI.</w:t>
+      </w:r>
+    </w:p>
+    <w:p>
+      <w:pPr>
+        <w:pStyle w:val="ListBullet"/>
+      </w:pPr>
+      <w:r>
+        <w:t>Usare Sostituisci foto sul singolo atleta per aggiungere o cambiare la sua immagine senza modificare il riferimento/nome o la bandiera scelta. La nuova foto reale viene resa disponibile ai FENCEWALL.</w:t>
+      </w:r>
+    </w:p>
+    <w:p>
+      <w:pPr>
+        <w:pStyle w:val="ListBullet"/>
+      </w:pPr>
+      <w:r>
+        <w:t>La funzione Cancella tutte le foto e i nomi è riservata agli amministratori ed è irreversibile. Non elimina video o bandiere.</w:t>
       </w:r>
     </w:p>
     <w:p>
@@ -2791,7 +2973,7 @@
         <w:pStyle w:val="ListBullet"/>
       </w:pPr>
       <w:r>
-        <w:t>Modalità corretta impostata da display: LEDWALL o SOTTOPEDANA.</w:t>
+        <w:t>Modalità corretta impostata dal display: LEDWALL, SOTTOPEDANA o MONITOR.</w:t>
       </w:r>
     </w:p>
     <w:p>
@@ -2815,7 +2997,7 @@
         <w:pStyle w:val="ListBullet"/>
       </w:pPr>
       <w:r>
-        <w:t>Video pubblicitari caricati sul portale, se richiesti.</w:t>
+        <w:t>PAUSA: verificare DOPO (minuti o NO), FONTE (INTERNET o USB) e i contenuti disponibili se la pausa è richiesta.</w:t>
       </w:r>
     </w:p>
     <w:p>
@@ -2871,6 +3053,10 @@
         <w:gridCol w:w="3364"/>
       </w:tblGrid>
       <w:tr>
+        <w:trPr>
+          <w:tblHeader/>
+          <w:cantSplit/>
+        </w:trPr>
         <w:tc>
           <w:tcPr>
             <w:tcW w:type="dxa" w:w="3364"/>
@@ -2942,6 +3128,9 @@
         </w:tc>
       </w:tr>
       <w:tr>
+        <w:trPr>
+          <w:cantSplit/>
+        </w:trPr>
         <w:tc>
           <w:tcPr>
             <w:tcW w:type="dxa" w:w="3364"/>
@@ -2998,6 +3187,9 @@
         </w:tc>
       </w:tr>
       <w:tr>
+        <w:trPr>
+          <w:cantSplit/>
+        </w:trPr>
         <w:tc>
           <w:tcPr>
             <w:tcW w:type="dxa" w:w="3364"/>
@@ -3026,11 +3218,8 @@
             <w:vAlign w:val="center"/>
           </w:tcPr>
           <w:p>
-            <w:pPr>
-              <w:spacing w:after="60"/>
-            </w:pPr>
             <w:r>
-              <w:t>Il timer non cambia o non arrivano dati.</w:t>
+              <w:t>PAUSA è attiva e non cambiano dati del tabellone oppure manca il flusso seriale.</w:t>
             </w:r>
           </w:p>
         </w:tc>
@@ -3044,16 +3233,16 @@
             <w:vAlign w:val="center"/>
           </w:tcPr>
           <w:p>
-            <w:pPr>
-              <w:spacing w:after="60"/>
-            </w:pPr>
             <w:r>
-              <w:t>Verificare apparato di scherma e cavo seriale. Controllare il valore SPOT.</w:t>
+              <w:t>Controllare i dati seriali e PAUSA &gt; DOPO. Se non si vuole la pausa automatica, scegliere NO.</w:t>
             </w:r>
           </w:p>
         </w:tc>
       </w:tr>
       <w:tr>
+        <w:trPr>
+          <w:cantSplit/>
+        </w:trPr>
         <w:tc>
           <w:tcPr>
             <w:tcW w:type="dxa" w:w="3364"/>
@@ -3100,16 +3289,16 @@
             <w:vAlign w:val="center"/>
           </w:tcPr>
           <w:p>
-            <w:pPr>
-              <w:spacing w:after="60"/>
-            </w:pPr>
             <w:r>
-              <w:t>Controllare il riferimento atleta nel portale e l’opzione AVATAR ATLETA.</w:t>
+              <w:t>Controllare riferimento, foto reale o placeholder import sul portale e AVATAR ATLETA sul display.</w:t>
             </w:r>
           </w:p>
         </w:tc>
       </w:tr>
       <w:tr>
+        <w:trPr>
+          <w:cantSplit/>
+        </w:trPr>
         <w:tc>
           <w:tcPr>
             <w:tcW w:type="dxa" w:w="3364"/>
@@ -3166,6 +3355,9 @@
         </w:tc>
       </w:tr>
       <w:tr>
+        <w:trPr>
+          <w:cantSplit/>
+        </w:trPr>
         <w:tc>
           <w:tcPr>
             <w:tcW w:type="dxa" w:w="3364"/>
@@ -3212,16 +3404,16 @@
             <w:vAlign w:val="center"/>
           </w:tcPr>
           <w:p>
-            <w:pPr>
-              <w:spacing w:after="60"/>
-            </w:pPr>
             <w:r>
-              <w:t>Entrare in MODE, scegliere LEDWALL o SOTTOPEDANA e salvare.</w:t>
+              <w:t>Entrare in MODE, scegliere LEDWALL, SOTTOPEDANA o MONITOR e salvare.</w:t>
             </w:r>
           </w:p>
         </w:tc>
       </w:tr>
       <w:tr>
+        <w:trPr>
+          <w:cantSplit/>
+        </w:trPr>
         <w:tc>
           <w:tcPr>
             <w:tcW w:type="dxa" w:w="3364"/>
@@ -3272,6 +3464,9 @@
         </w:tc>
       </w:tr>
       <w:tr>
+        <w:trPr>
+          <w:cantSplit/>
+        </w:trPr>
         <w:tc>
           <w:tcPr>
             <w:tcW w:type="dxa" w:w="3364"/>
@@ -3304,6 +3499,9 @@
         </w:tc>
       </w:tr>
       <w:tr>
+        <w:trPr>
+          <w:cantSplit/>
+        </w:trPr>
         <w:tc>
           <w:tcPr>
             <w:tcW w:type="dxa" w:w="3364"/>
@@ -3331,6 +3529,56 @@
           <w:p>
             <w:r>
               <w:t>Usare sempre POWER OFF dal display, poi attendere lo spegnimento completo prima di agire sull’interruttore.</w:t>
+            </w:r>
+          </w:p>
+        </w:tc>
+      </w:tr>
+      <w:tr>
+        <w:trPr>
+          <w:cantSplit/>
+        </w:trPr>
+        <w:tc>
+          <w:tcPr>
+            <w:tcW w:type="dxa" w:w="3364"/>
+            <w:top w:val="single" w:sz="8" w:space="0" w:color="D0D5DD"/>
+            <w:left w:val="single" w:sz="8" w:space="0" w:color="D0D5DD"/>
+            <w:bottom w:val="single" w:sz="8" w:space="0" w:color="D0D5DD"/>
+            <w:right w:val="single" w:sz="8" w:space="0" w:color="D0D5DD"/>
+            <w:vAlign w:val="center"/>
+          </w:tcPr>
+          <w:p>
+            <w:r>
+              <w:t>Importazione USB fallita</w:t>
+            </w:r>
+          </w:p>
+        </w:tc>
+        <w:tc>
+          <w:tcPr>
+            <w:tcW w:type="dxa" w:w="3364"/>
+            <w:top w:val="single" w:sz="8" w:space="0" w:color="D0D5DD"/>
+            <w:left w:val="single" w:sz="8" w:space="0" w:color="D0D5DD"/>
+            <w:bottom w:val="single" w:sz="8" w:space="0" w:color="D0D5DD"/>
+            <w:right w:val="single" w:sz="8" w:space="0" w:color="D0D5DD"/>
+            <w:vAlign w:val="center"/>
+          </w:tcPr>
+          <w:p>
+            <w:r>
+              <w:t>Cartella PAUSA mancante/vuota, file non valido, spazio insufficiente o conversione video fallita.</w:t>
+            </w:r>
+          </w:p>
+        </w:tc>
+        <w:tc>
+          <w:tcPr>
+            <w:tcW w:type="dxa" w:w="3364"/>
+            <w:top w:val="single" w:sz="8" w:space="0" w:color="D0D5DD"/>
+            <w:left w:val="single" w:sz="8" w:space="0" w:color="D0D5DD"/>
+            <w:bottom w:val="single" w:sz="8" w:space="0" w:color="D0D5DD"/>
+            <w:right w:val="single" w:sz="8" w:space="0" w:color="D0D5DD"/>
+            <w:vAlign w:val="center"/>
+          </w:tcPr>
+          <w:p>
+            <w:r>
+              <w:t>Verificare la chiavetta e riprovare. La precedente pausa USB resta disponibile se l'importazione fallisce.</w:t>
             </w:r>
           </w:p>
         </w:tc>
@@ -3365,7 +3613,7 @@
         <w:pStyle w:val="ListBullet"/>
       </w:pPr>
       <w:r>
-        <w:t>Per aggiornamenti software usare preferibilmente la voce UPDATE del display: questa scarica gli aggiornamenti e installa anche le dipendenze necessarie, come QRCode del manuale e ottimizzazione video pubblicitari.</w:t>
+        <w:t>Per aggiornare il software usare la voce UPDATE del display con Internet disponibile. Per la pausa USB non occorre Internet dopo l'importazione.</w:t>
       </w:r>
     </w:p>
     <w:p>
@@ -3398,7 +3646,7 @@
     </w:pPr>
     <w:r>
       <w:rPr/>
-      <w:t xml:space="preserve">FENCEWALL by SCHERMALAB - Manuale utente finale - versione 1.2 - 07/08/2026 - pagina </w:t>
+      <w:t xml:space="preserve">FENCEWALL by SCHERMALAB - Manuale utente finale - versione 1.2.1 - 29/10/2026 - pagina </w:t>
     </w:r>
     <w:r>
       <w:fldChar w:fldCharType="begin"/>

</xml_diff>